<commit_message>
docs: rebuild the Word handbook from the corrected HTML
Catches the Word version up with the rewritten passage on what the email-link
button does. Both formats now say the same thing, which is the whole reason
the .docx is committed rather than left to be rebuilt by whoever remembers.

Co-Authored-By: Claude Opus 5 <noreply@anthropic.com>
</commit_message>
<xml_diff>
--- a/docs/LCM Finance Handbook.docx
+++ b/docs/LCM Finance Handbook.docx
@@ -87,7 +87,7 @@
       <w:r>
         <w:fldChar w:fldCharType="separate"/>
       </w:r>
-      <w:hyperlink w:anchor="_Toc240640173" w:history="1">
+      <w:hyperlink w:anchor="_Toc240642051" w:history="1">
         <w:r>
           <w:rPr>
             <w:rStyle w:val="Hyperlink"/>
@@ -115,7 +115,7 @@
             <w:noProof/>
             <w:webHidden/>
           </w:rPr>
-          <w:instrText xml:space="preserve"> PAGEREF _Toc240640173 \h </w:instrText>
+          <w:instrText xml:space="preserve"> PAGEREF _Toc240642051 \h </w:instrText>
         </w:r>
         <w:r>
           <w:rPr>
@@ -163,7 +163,7 @@
           <w14:ligatures w14:val="standardContextual"/>
         </w:rPr>
       </w:pPr>
-      <w:hyperlink w:anchor="_Toc240640174" w:history="1">
+      <w:hyperlink w:anchor="_Toc240642052" w:history="1">
         <w:r>
           <w:rPr>
             <w:rStyle w:val="Hyperlink"/>
@@ -191,7 +191,7 @@
             <w:noProof/>
             <w:webHidden/>
           </w:rPr>
-          <w:instrText xml:space="preserve"> PAGEREF _Toc240640174 \h </w:instrText>
+          <w:instrText xml:space="preserve"> PAGEREF _Toc240642052 \h </w:instrText>
         </w:r>
         <w:r>
           <w:rPr>
@@ -239,7 +239,7 @@
           <w14:ligatures w14:val="standardContextual"/>
         </w:rPr>
       </w:pPr>
-      <w:hyperlink w:anchor="_Toc240640175" w:history="1">
+      <w:hyperlink w:anchor="_Toc240642053" w:history="1">
         <w:r>
           <w:rPr>
             <w:rStyle w:val="Hyperlink"/>
@@ -267,7 +267,7 @@
             <w:noProof/>
             <w:webHidden/>
           </w:rPr>
-          <w:instrText xml:space="preserve"> PAGEREF _Toc240640175 \h </w:instrText>
+          <w:instrText xml:space="preserve"> PAGEREF _Toc240642053 \h </w:instrText>
         </w:r>
         <w:r>
           <w:rPr>
@@ -315,7 +315,7 @@
           <w14:ligatures w14:val="standardContextual"/>
         </w:rPr>
       </w:pPr>
-      <w:hyperlink w:anchor="_Toc240640176" w:history="1">
+      <w:hyperlink w:anchor="_Toc240642054" w:history="1">
         <w:r>
           <w:rPr>
             <w:rStyle w:val="Hyperlink"/>
@@ -343,7 +343,7 @@
             <w:noProof/>
             <w:webHidden/>
           </w:rPr>
-          <w:instrText xml:space="preserve"> PAGEREF _Toc240640176 \h </w:instrText>
+          <w:instrText xml:space="preserve"> PAGEREF _Toc240642054 \h </w:instrText>
         </w:r>
         <w:r>
           <w:rPr>
@@ -363,7 +363,7 @@
             <w:noProof/>
             <w:webHidden/>
           </w:rPr>
-          <w:t>5</w:t>
+          <w:t>6</w:t>
         </w:r>
         <w:r>
           <w:rPr>
@@ -391,7 +391,7 @@
           <w14:ligatures w14:val="standardContextual"/>
         </w:rPr>
       </w:pPr>
-      <w:hyperlink w:anchor="_Toc240640177" w:history="1">
+      <w:hyperlink w:anchor="_Toc240642055" w:history="1">
         <w:r>
           <w:rPr>
             <w:rStyle w:val="Hyperlink"/>
@@ -419,7 +419,7 @@
             <w:noProof/>
             <w:webHidden/>
           </w:rPr>
-          <w:instrText xml:space="preserve"> PAGEREF _Toc240640177 \h </w:instrText>
+          <w:instrText xml:space="preserve"> PAGEREF _Toc240642055 \h </w:instrText>
         </w:r>
         <w:r>
           <w:rPr>
@@ -439,7 +439,7 @@
             <w:noProof/>
             <w:webHidden/>
           </w:rPr>
-          <w:t>6</w:t>
+          <w:t>7</w:t>
         </w:r>
         <w:r>
           <w:rPr>
@@ -467,7 +467,7 @@
           <w14:ligatures w14:val="standardContextual"/>
         </w:rPr>
       </w:pPr>
-      <w:hyperlink w:anchor="_Toc240640178" w:history="1">
+      <w:hyperlink w:anchor="_Toc240642056" w:history="1">
         <w:r>
           <w:rPr>
             <w:rStyle w:val="Hyperlink"/>
@@ -495,7 +495,7 @@
             <w:noProof/>
             <w:webHidden/>
           </w:rPr>
-          <w:instrText xml:space="preserve"> PAGEREF _Toc240640178 \h </w:instrText>
+          <w:instrText xml:space="preserve"> PAGEREF _Toc240642056 \h </w:instrText>
         </w:r>
         <w:r>
           <w:rPr>
@@ -515,7 +515,7 @@
             <w:noProof/>
             <w:webHidden/>
           </w:rPr>
-          <w:t>8</w:t>
+          <w:t>9</w:t>
         </w:r>
         <w:r>
           <w:rPr>
@@ -543,7 +543,7 @@
           <w14:ligatures w14:val="standardContextual"/>
         </w:rPr>
       </w:pPr>
-      <w:hyperlink w:anchor="_Toc240640179" w:history="1">
+      <w:hyperlink w:anchor="_Toc240642057" w:history="1">
         <w:r>
           <w:rPr>
             <w:rStyle w:val="Hyperlink"/>
@@ -571,7 +571,7 @@
             <w:noProof/>
             <w:webHidden/>
           </w:rPr>
-          <w:instrText xml:space="preserve"> PAGEREF _Toc240640179 \h </w:instrText>
+          <w:instrText xml:space="preserve"> PAGEREF _Toc240642057 \h </w:instrText>
         </w:r>
         <w:r>
           <w:rPr>
@@ -591,7 +591,7 @@
             <w:noProof/>
             <w:webHidden/>
           </w:rPr>
-          <w:t>8</w:t>
+          <w:t>9</w:t>
         </w:r>
         <w:r>
           <w:rPr>
@@ -619,7 +619,7 @@
           <w14:ligatures w14:val="standardContextual"/>
         </w:rPr>
       </w:pPr>
-      <w:hyperlink w:anchor="_Toc240640180" w:history="1">
+      <w:hyperlink w:anchor="_Toc240642058" w:history="1">
         <w:r>
           <w:rPr>
             <w:rStyle w:val="Hyperlink"/>
@@ -647,7 +647,7 @@
             <w:noProof/>
             <w:webHidden/>
           </w:rPr>
-          <w:instrText xml:space="preserve"> PAGEREF _Toc240640180 \h </w:instrText>
+          <w:instrText xml:space="preserve"> PAGEREF _Toc240642058 \h </w:instrText>
         </w:r>
         <w:r>
           <w:rPr>
@@ -667,7 +667,7 @@
             <w:noProof/>
             <w:webHidden/>
           </w:rPr>
-          <w:t>9</w:t>
+          <w:t>10</w:t>
         </w:r>
         <w:r>
           <w:rPr>
@@ -695,7 +695,7 @@
           <w14:ligatures w14:val="standardContextual"/>
         </w:rPr>
       </w:pPr>
-      <w:hyperlink w:anchor="_Toc240640181" w:history="1">
+      <w:hyperlink w:anchor="_Toc240642059" w:history="1">
         <w:r>
           <w:rPr>
             <w:rStyle w:val="Hyperlink"/>
@@ -723,7 +723,7 @@
             <w:noProof/>
             <w:webHidden/>
           </w:rPr>
-          <w:instrText xml:space="preserve"> PAGEREF _Toc240640181 \h </w:instrText>
+          <w:instrText xml:space="preserve"> PAGEREF _Toc240642059 \h </w:instrText>
         </w:r>
         <w:r>
           <w:rPr>
@@ -743,7 +743,7 @@
             <w:noProof/>
             <w:webHidden/>
           </w:rPr>
-          <w:t>9</w:t>
+          <w:t>10</w:t>
         </w:r>
         <w:r>
           <w:rPr>
@@ -771,7 +771,7 @@
           <w14:ligatures w14:val="standardContextual"/>
         </w:rPr>
       </w:pPr>
-      <w:hyperlink w:anchor="_Toc240640182" w:history="1">
+      <w:hyperlink w:anchor="_Toc240642060" w:history="1">
         <w:r>
           <w:rPr>
             <w:rStyle w:val="Hyperlink"/>
@@ -799,7 +799,7 @@
             <w:noProof/>
             <w:webHidden/>
           </w:rPr>
-          <w:instrText xml:space="preserve"> PAGEREF _Toc240640182 \h </w:instrText>
+          <w:instrText xml:space="preserve"> PAGEREF _Toc240642060 \h </w:instrText>
         </w:r>
         <w:r>
           <w:rPr>
@@ -819,7 +819,7 @@
             <w:noProof/>
             <w:webHidden/>
           </w:rPr>
-          <w:t>9</w:t>
+          <w:t>10</w:t>
         </w:r>
         <w:r>
           <w:rPr>
@@ -847,7 +847,7 @@
           <w14:ligatures w14:val="standardContextual"/>
         </w:rPr>
       </w:pPr>
-      <w:hyperlink w:anchor="_Toc240640183" w:history="1">
+      <w:hyperlink w:anchor="_Toc240642061" w:history="1">
         <w:r>
           <w:rPr>
             <w:rStyle w:val="Hyperlink"/>
@@ -875,7 +875,7 @@
             <w:noProof/>
             <w:webHidden/>
           </w:rPr>
-          <w:instrText xml:space="preserve"> PAGEREF _Toc240640183 \h </w:instrText>
+          <w:instrText xml:space="preserve"> PAGEREF _Toc240642061 \h </w:instrText>
         </w:r>
         <w:r>
           <w:rPr>
@@ -895,7 +895,7 @@
             <w:noProof/>
             <w:webHidden/>
           </w:rPr>
-          <w:t>10</w:t>
+          <w:t>11</w:t>
         </w:r>
         <w:r>
           <w:rPr>
@@ -923,7 +923,7 @@
           <w14:ligatures w14:val="standardContextual"/>
         </w:rPr>
       </w:pPr>
-      <w:hyperlink w:anchor="_Toc240640184" w:history="1">
+      <w:hyperlink w:anchor="_Toc240642062" w:history="1">
         <w:r>
           <w:rPr>
             <w:rStyle w:val="Hyperlink"/>
@@ -951,7 +951,7 @@
             <w:noProof/>
             <w:webHidden/>
           </w:rPr>
-          <w:instrText xml:space="preserve"> PAGEREF _Toc240640184 \h </w:instrText>
+          <w:instrText xml:space="preserve"> PAGEREF _Toc240642062 \h </w:instrText>
         </w:r>
         <w:r>
           <w:rPr>
@@ -971,7 +971,7 @@
             <w:noProof/>
             <w:webHidden/>
           </w:rPr>
-          <w:t>10</w:t>
+          <w:t>11</w:t>
         </w:r>
         <w:r>
           <w:rPr>
@@ -999,7 +999,7 @@
           <w14:ligatures w14:val="standardContextual"/>
         </w:rPr>
       </w:pPr>
-      <w:hyperlink w:anchor="_Toc240640185" w:history="1">
+      <w:hyperlink w:anchor="_Toc240642063" w:history="1">
         <w:r>
           <w:rPr>
             <w:rStyle w:val="Hyperlink"/>
@@ -1027,7 +1027,7 @@
             <w:noProof/>
             <w:webHidden/>
           </w:rPr>
-          <w:instrText xml:space="preserve"> PAGEREF _Toc240640185 \h </w:instrText>
+          <w:instrText xml:space="preserve"> PAGEREF _Toc240642063 \h </w:instrText>
         </w:r>
         <w:r>
           <w:rPr>
@@ -1047,7 +1047,7 @@
             <w:noProof/>
             <w:webHidden/>
           </w:rPr>
-          <w:t>10</w:t>
+          <w:t>11</w:t>
         </w:r>
         <w:r>
           <w:rPr>
@@ -1075,7 +1075,7 @@
           <w14:ligatures w14:val="standardContextual"/>
         </w:rPr>
       </w:pPr>
-      <w:hyperlink w:anchor="_Toc240640186" w:history="1">
+      <w:hyperlink w:anchor="_Toc240642064" w:history="1">
         <w:r>
           <w:rPr>
             <w:rStyle w:val="Hyperlink"/>
@@ -1103,7 +1103,7 @@
             <w:noProof/>
             <w:webHidden/>
           </w:rPr>
-          <w:instrText xml:space="preserve"> PAGEREF _Toc240640186 \h </w:instrText>
+          <w:instrText xml:space="preserve"> PAGEREF _Toc240642064 \h </w:instrText>
         </w:r>
         <w:r>
           <w:rPr>
@@ -1123,7 +1123,7 @@
             <w:noProof/>
             <w:webHidden/>
           </w:rPr>
-          <w:t>10</w:t>
+          <w:t>11</w:t>
         </w:r>
         <w:r>
           <w:rPr>
@@ -1151,7 +1151,7 @@
           <w14:ligatures w14:val="standardContextual"/>
         </w:rPr>
       </w:pPr>
-      <w:hyperlink w:anchor="_Toc240640187" w:history="1">
+      <w:hyperlink w:anchor="_Toc240642065" w:history="1">
         <w:r>
           <w:rPr>
             <w:rStyle w:val="Hyperlink"/>
@@ -1179,7 +1179,7 @@
             <w:noProof/>
             <w:webHidden/>
           </w:rPr>
-          <w:instrText xml:space="preserve"> PAGEREF _Toc240640187 \h </w:instrText>
+          <w:instrText xml:space="preserve"> PAGEREF _Toc240642065 \h </w:instrText>
         </w:r>
         <w:r>
           <w:rPr>
@@ -1199,7 +1199,7 @@
             <w:noProof/>
             <w:webHidden/>
           </w:rPr>
-          <w:t>12</w:t>
+          <w:t>13</w:t>
         </w:r>
         <w:r>
           <w:rPr>
@@ -1227,7 +1227,7 @@
           <w14:ligatures w14:val="standardContextual"/>
         </w:rPr>
       </w:pPr>
-      <w:hyperlink w:anchor="_Toc240640188" w:history="1">
+      <w:hyperlink w:anchor="_Toc240642066" w:history="1">
         <w:r>
           <w:rPr>
             <w:rStyle w:val="Hyperlink"/>
@@ -1255,7 +1255,7 @@
             <w:noProof/>
             <w:webHidden/>
           </w:rPr>
-          <w:instrText xml:space="preserve"> PAGEREF _Toc240640188 \h </w:instrText>
+          <w:instrText xml:space="preserve"> PAGEREF _Toc240642066 \h </w:instrText>
         </w:r>
         <w:r>
           <w:rPr>
@@ -1275,7 +1275,7 @@
             <w:noProof/>
             <w:webHidden/>
           </w:rPr>
-          <w:t>12</w:t>
+          <w:t>13</w:t>
         </w:r>
         <w:r>
           <w:rPr>
@@ -1303,7 +1303,7 @@
           <w14:ligatures w14:val="standardContextual"/>
         </w:rPr>
       </w:pPr>
-      <w:hyperlink w:anchor="_Toc240640189" w:history="1">
+      <w:hyperlink w:anchor="_Toc240642067" w:history="1">
         <w:r>
           <w:rPr>
             <w:rStyle w:val="Hyperlink"/>
@@ -1331,7 +1331,7 @@
             <w:noProof/>
             <w:webHidden/>
           </w:rPr>
-          <w:instrText xml:space="preserve"> PAGEREF _Toc240640189 \h </w:instrText>
+          <w:instrText xml:space="preserve"> PAGEREF _Toc240642067 \h </w:instrText>
         </w:r>
         <w:r>
           <w:rPr>
@@ -1351,7 +1351,7 @@
             <w:noProof/>
             <w:webHidden/>
           </w:rPr>
-          <w:t>13</w:t>
+          <w:t>14</w:t>
         </w:r>
         <w:r>
           <w:rPr>
@@ -1379,7 +1379,7 @@
           <w14:ligatures w14:val="standardContextual"/>
         </w:rPr>
       </w:pPr>
-      <w:hyperlink w:anchor="_Toc240640190" w:history="1">
+      <w:hyperlink w:anchor="_Toc240642068" w:history="1">
         <w:r>
           <w:rPr>
             <w:rStyle w:val="Hyperlink"/>
@@ -1407,7 +1407,7 @@
             <w:noProof/>
             <w:webHidden/>
           </w:rPr>
-          <w:instrText xml:space="preserve"> PAGEREF _Toc240640190 \h </w:instrText>
+          <w:instrText xml:space="preserve"> PAGEREF _Toc240642068 \h </w:instrText>
         </w:r>
         <w:r>
           <w:rPr>
@@ -1427,7 +1427,7 @@
             <w:noProof/>
             <w:webHidden/>
           </w:rPr>
-          <w:t>16</w:t>
+          <w:t>17</w:t>
         </w:r>
         <w:r>
           <w:rPr>
@@ -1455,7 +1455,7 @@
           <w14:ligatures w14:val="standardContextual"/>
         </w:rPr>
       </w:pPr>
-      <w:hyperlink w:anchor="_Toc240640191" w:history="1">
+      <w:hyperlink w:anchor="_Toc240642069" w:history="1">
         <w:r>
           <w:rPr>
             <w:rStyle w:val="Hyperlink"/>
@@ -1483,7 +1483,7 @@
             <w:noProof/>
             <w:webHidden/>
           </w:rPr>
-          <w:instrText xml:space="preserve"> PAGEREF _Toc240640191 \h </w:instrText>
+          <w:instrText xml:space="preserve"> PAGEREF _Toc240642069 \h </w:instrText>
         </w:r>
         <w:r>
           <w:rPr>
@@ -1503,7 +1503,7 @@
             <w:noProof/>
             <w:webHidden/>
           </w:rPr>
-          <w:t>16</w:t>
+          <w:t>17</w:t>
         </w:r>
         <w:r>
           <w:rPr>
@@ -1531,7 +1531,7 @@
           <w14:ligatures w14:val="standardContextual"/>
         </w:rPr>
       </w:pPr>
-      <w:hyperlink w:anchor="_Toc240640192" w:history="1">
+      <w:hyperlink w:anchor="_Toc240642070" w:history="1">
         <w:r>
           <w:rPr>
             <w:rStyle w:val="Hyperlink"/>
@@ -1559,7 +1559,7 @@
             <w:noProof/>
             <w:webHidden/>
           </w:rPr>
-          <w:instrText xml:space="preserve"> PAGEREF _Toc240640192 \h </w:instrText>
+          <w:instrText xml:space="preserve"> PAGEREF _Toc240642070 \h </w:instrText>
         </w:r>
         <w:r>
           <w:rPr>
@@ -1579,7 +1579,7 @@
             <w:noProof/>
             <w:webHidden/>
           </w:rPr>
-          <w:t>16</w:t>
+          <w:t>17</w:t>
         </w:r>
         <w:r>
           <w:rPr>
@@ -1607,7 +1607,7 @@
           <w14:ligatures w14:val="standardContextual"/>
         </w:rPr>
       </w:pPr>
-      <w:hyperlink w:anchor="_Toc240640193" w:history="1">
+      <w:hyperlink w:anchor="_Toc240642071" w:history="1">
         <w:r>
           <w:rPr>
             <w:rStyle w:val="Hyperlink"/>
@@ -1635,7 +1635,7 @@
             <w:noProof/>
             <w:webHidden/>
           </w:rPr>
-          <w:instrText xml:space="preserve"> PAGEREF _Toc240640193 \h </w:instrText>
+          <w:instrText xml:space="preserve"> PAGEREF _Toc240642071 \h </w:instrText>
         </w:r>
         <w:r>
           <w:rPr>
@@ -1655,7 +1655,7 @@
             <w:noProof/>
             <w:webHidden/>
           </w:rPr>
-          <w:t>17</w:t>
+          <w:t>18</w:t>
         </w:r>
         <w:r>
           <w:rPr>
@@ -1683,7 +1683,7 @@
           <w14:ligatures w14:val="standardContextual"/>
         </w:rPr>
       </w:pPr>
-      <w:hyperlink w:anchor="_Toc240640194" w:history="1">
+      <w:hyperlink w:anchor="_Toc240642072" w:history="1">
         <w:r>
           <w:rPr>
             <w:rStyle w:val="Hyperlink"/>
@@ -1711,7 +1711,7 @@
             <w:noProof/>
             <w:webHidden/>
           </w:rPr>
-          <w:instrText xml:space="preserve"> PAGEREF _Toc240640194 \h </w:instrText>
+          <w:instrText xml:space="preserve"> PAGEREF _Toc240642072 \h </w:instrText>
         </w:r>
         <w:r>
           <w:rPr>
@@ -1731,7 +1731,7 @@
             <w:noProof/>
             <w:webHidden/>
           </w:rPr>
-          <w:t>18</w:t>
+          <w:t>19</w:t>
         </w:r>
         <w:r>
           <w:rPr>
@@ -1759,7 +1759,7 @@
           <w14:ligatures w14:val="standardContextual"/>
         </w:rPr>
       </w:pPr>
-      <w:hyperlink w:anchor="_Toc240640195" w:history="1">
+      <w:hyperlink w:anchor="_Toc240642073" w:history="1">
         <w:r>
           <w:rPr>
             <w:rStyle w:val="Hyperlink"/>
@@ -1787,7 +1787,7 @@
             <w:noProof/>
             <w:webHidden/>
           </w:rPr>
-          <w:instrText xml:space="preserve"> PAGEREF _Toc240640195 \h </w:instrText>
+          <w:instrText xml:space="preserve"> PAGEREF _Toc240642073 \h </w:instrText>
         </w:r>
         <w:r>
           <w:rPr>
@@ -1807,7 +1807,7 @@
             <w:noProof/>
             <w:webHidden/>
           </w:rPr>
-          <w:t>19</w:t>
+          <w:t>20</w:t>
         </w:r>
         <w:r>
           <w:rPr>
@@ -1835,7 +1835,7 @@
           <w14:ligatures w14:val="standardContextual"/>
         </w:rPr>
       </w:pPr>
-      <w:hyperlink w:anchor="_Toc240640196" w:history="1">
+      <w:hyperlink w:anchor="_Toc240642074" w:history="1">
         <w:r>
           <w:rPr>
             <w:rStyle w:val="Hyperlink"/>
@@ -1863,7 +1863,7 @@
             <w:noProof/>
             <w:webHidden/>
           </w:rPr>
-          <w:instrText xml:space="preserve"> PAGEREF _Toc240640196 \h </w:instrText>
+          <w:instrText xml:space="preserve"> PAGEREF _Toc240642074 \h </w:instrText>
         </w:r>
         <w:r>
           <w:rPr>
@@ -1883,7 +1883,7 @@
             <w:noProof/>
             <w:webHidden/>
           </w:rPr>
-          <w:t>20</w:t>
+          <w:t>21</w:t>
         </w:r>
         <w:r>
           <w:rPr>
@@ -1911,7 +1911,7 @@
           <w14:ligatures w14:val="standardContextual"/>
         </w:rPr>
       </w:pPr>
-      <w:hyperlink w:anchor="_Toc240640197" w:history="1">
+      <w:hyperlink w:anchor="_Toc240642075" w:history="1">
         <w:r>
           <w:rPr>
             <w:rStyle w:val="Hyperlink"/>
@@ -1939,7 +1939,7 @@
             <w:noProof/>
             <w:webHidden/>
           </w:rPr>
-          <w:instrText xml:space="preserve"> PAGEREF _Toc240640197 \h </w:instrText>
+          <w:instrText xml:space="preserve"> PAGEREF _Toc240642075 \h </w:instrText>
         </w:r>
         <w:r>
           <w:rPr>
@@ -1959,7 +1959,7 @@
             <w:noProof/>
             <w:webHidden/>
           </w:rPr>
-          <w:t>21</w:t>
+          <w:t>22</w:t>
         </w:r>
         <w:r>
           <w:rPr>
@@ -1987,7 +1987,7 @@
           <w14:ligatures w14:val="standardContextual"/>
         </w:rPr>
       </w:pPr>
-      <w:hyperlink w:anchor="_Toc240640198" w:history="1">
+      <w:hyperlink w:anchor="_Toc240642076" w:history="1">
         <w:r>
           <w:rPr>
             <w:rStyle w:val="Hyperlink"/>
@@ -2015,7 +2015,7 @@
             <w:noProof/>
             <w:webHidden/>
           </w:rPr>
-          <w:instrText xml:space="preserve"> PAGEREF _Toc240640198 \h </w:instrText>
+          <w:instrText xml:space="preserve"> PAGEREF _Toc240642076 \h </w:instrText>
         </w:r>
         <w:r>
           <w:rPr>
@@ -2035,7 +2035,7 @@
             <w:noProof/>
             <w:webHidden/>
           </w:rPr>
-          <w:t>21</w:t>
+          <w:t>22</w:t>
         </w:r>
         <w:r>
           <w:rPr>
@@ -2063,7 +2063,7 @@
           <w14:ligatures w14:val="standardContextual"/>
         </w:rPr>
       </w:pPr>
-      <w:hyperlink w:anchor="_Toc240640199" w:history="1">
+      <w:hyperlink w:anchor="_Toc240642077" w:history="1">
         <w:r>
           <w:rPr>
             <w:rStyle w:val="Hyperlink"/>
@@ -2091,7 +2091,7 @@
             <w:noProof/>
             <w:webHidden/>
           </w:rPr>
-          <w:instrText xml:space="preserve"> PAGEREF _Toc240640199 \h </w:instrText>
+          <w:instrText xml:space="preserve"> PAGEREF _Toc240642077 \h </w:instrText>
         </w:r>
         <w:r>
           <w:rPr>
@@ -2111,7 +2111,7 @@
             <w:noProof/>
             <w:webHidden/>
           </w:rPr>
-          <w:t>22</w:t>
+          <w:t>23</w:t>
         </w:r>
         <w:r>
           <w:rPr>
@@ -2139,7 +2139,7 @@
           <w14:ligatures w14:val="standardContextual"/>
         </w:rPr>
       </w:pPr>
-      <w:hyperlink w:anchor="_Toc240640200" w:history="1">
+      <w:hyperlink w:anchor="_Toc240642078" w:history="1">
         <w:r>
           <w:rPr>
             <w:rStyle w:val="Hyperlink"/>
@@ -2167,7 +2167,7 @@
             <w:noProof/>
             <w:webHidden/>
           </w:rPr>
-          <w:instrText xml:space="preserve"> PAGEREF _Toc240640200 \h </w:instrText>
+          <w:instrText xml:space="preserve"> PAGEREF _Toc240642078 \h </w:instrText>
         </w:r>
         <w:r>
           <w:rPr>
@@ -2187,7 +2187,7 @@
             <w:noProof/>
             <w:webHidden/>
           </w:rPr>
-          <w:t>24</w:t>
+          <w:t>25</w:t>
         </w:r>
         <w:r>
           <w:rPr>
@@ -2215,7 +2215,7 @@
           <w14:ligatures w14:val="standardContextual"/>
         </w:rPr>
       </w:pPr>
-      <w:hyperlink w:anchor="_Toc240640201" w:history="1">
+      <w:hyperlink w:anchor="_Toc240642079" w:history="1">
         <w:r>
           <w:rPr>
             <w:rStyle w:val="Hyperlink"/>
@@ -2243,7 +2243,7 @@
             <w:noProof/>
             <w:webHidden/>
           </w:rPr>
-          <w:instrText xml:space="preserve"> PAGEREF _Toc240640201 \h </w:instrText>
+          <w:instrText xml:space="preserve"> PAGEREF _Toc240642079 \h </w:instrText>
         </w:r>
         <w:r>
           <w:rPr>
@@ -2263,7 +2263,7 @@
             <w:noProof/>
             <w:webHidden/>
           </w:rPr>
-          <w:t>26</w:t>
+          <w:t>27</w:t>
         </w:r>
         <w:r>
           <w:rPr>
@@ -2291,7 +2291,7 @@
           <w14:ligatures w14:val="standardContextual"/>
         </w:rPr>
       </w:pPr>
-      <w:hyperlink w:anchor="_Toc240640202" w:history="1">
+      <w:hyperlink w:anchor="_Toc240642080" w:history="1">
         <w:r>
           <w:rPr>
             <w:rStyle w:val="Hyperlink"/>
@@ -2319,7 +2319,7 @@
             <w:noProof/>
             <w:webHidden/>
           </w:rPr>
-          <w:instrText xml:space="preserve"> PAGEREF _Toc240640202 \h </w:instrText>
+          <w:instrText xml:space="preserve"> PAGEREF _Toc240642080 \h </w:instrText>
         </w:r>
         <w:r>
           <w:rPr>
@@ -2339,7 +2339,7 @@
             <w:noProof/>
             <w:webHidden/>
           </w:rPr>
-          <w:t>28</w:t>
+          <w:t>29</w:t>
         </w:r>
         <w:r>
           <w:rPr>
@@ -2367,7 +2367,7 @@
           <w14:ligatures w14:val="standardContextual"/>
         </w:rPr>
       </w:pPr>
-      <w:hyperlink w:anchor="_Toc240640203" w:history="1">
+      <w:hyperlink w:anchor="_Toc240642081" w:history="1">
         <w:r>
           <w:rPr>
             <w:rStyle w:val="Hyperlink"/>
@@ -2395,7 +2395,7 @@
             <w:noProof/>
             <w:webHidden/>
           </w:rPr>
-          <w:instrText xml:space="preserve"> PAGEREF _Toc240640203 \h </w:instrText>
+          <w:instrText xml:space="preserve"> PAGEREF _Toc240642081 \h </w:instrText>
         </w:r>
         <w:r>
           <w:rPr>
@@ -2415,7 +2415,7 @@
             <w:noProof/>
             <w:webHidden/>
           </w:rPr>
-          <w:t>29</w:t>
+          <w:t>30</w:t>
         </w:r>
         <w:r>
           <w:rPr>
@@ -2443,7 +2443,7 @@
           <w14:ligatures w14:val="standardContextual"/>
         </w:rPr>
       </w:pPr>
-      <w:hyperlink w:anchor="_Toc240640204" w:history="1">
+      <w:hyperlink w:anchor="_Toc240642082" w:history="1">
         <w:r>
           <w:rPr>
             <w:rStyle w:val="Hyperlink"/>
@@ -2471,7 +2471,7 @@
             <w:noProof/>
             <w:webHidden/>
           </w:rPr>
-          <w:instrText xml:space="preserve"> PAGEREF _Toc240640204 \h </w:instrText>
+          <w:instrText xml:space="preserve"> PAGEREF _Toc240642082 \h </w:instrText>
         </w:r>
         <w:r>
           <w:rPr>
@@ -2491,7 +2491,7 @@
             <w:noProof/>
             <w:webHidden/>
           </w:rPr>
-          <w:t>29</w:t>
+          <w:t>30</w:t>
         </w:r>
         <w:r>
           <w:rPr>
@@ -2519,7 +2519,7 @@
           <w14:ligatures w14:val="standardContextual"/>
         </w:rPr>
       </w:pPr>
-      <w:hyperlink w:anchor="_Toc240640205" w:history="1">
+      <w:hyperlink w:anchor="_Toc240642083" w:history="1">
         <w:r>
           <w:rPr>
             <w:rStyle w:val="Hyperlink"/>
@@ -2547,7 +2547,7 @@
             <w:noProof/>
             <w:webHidden/>
           </w:rPr>
-          <w:instrText xml:space="preserve"> PAGEREF _Toc240640205 \h </w:instrText>
+          <w:instrText xml:space="preserve"> PAGEREF _Toc240642083 \h </w:instrText>
         </w:r>
         <w:r>
           <w:rPr>
@@ -2567,7 +2567,7 @@
             <w:noProof/>
             <w:webHidden/>
           </w:rPr>
-          <w:t>29</w:t>
+          <w:t>30</w:t>
         </w:r>
         <w:r>
           <w:rPr>
@@ -2595,7 +2595,7 @@
           <w14:ligatures w14:val="standardContextual"/>
         </w:rPr>
       </w:pPr>
-      <w:hyperlink w:anchor="_Toc240640206" w:history="1">
+      <w:hyperlink w:anchor="_Toc240642084" w:history="1">
         <w:r>
           <w:rPr>
             <w:rStyle w:val="Hyperlink"/>
@@ -2623,7 +2623,7 @@
             <w:noProof/>
             <w:webHidden/>
           </w:rPr>
-          <w:instrText xml:space="preserve"> PAGEREF _Toc240640206 \h </w:instrText>
+          <w:instrText xml:space="preserve"> PAGEREF _Toc240642084 \h </w:instrText>
         </w:r>
         <w:r>
           <w:rPr>
@@ -2643,7 +2643,7 @@
             <w:noProof/>
             <w:webHidden/>
           </w:rPr>
-          <w:t>29</w:t>
+          <w:t>30</w:t>
         </w:r>
         <w:r>
           <w:rPr>
@@ -2671,7 +2671,7 @@
           <w14:ligatures w14:val="standardContextual"/>
         </w:rPr>
       </w:pPr>
-      <w:hyperlink w:anchor="_Toc240640207" w:history="1">
+      <w:hyperlink w:anchor="_Toc240642085" w:history="1">
         <w:r>
           <w:rPr>
             <w:rStyle w:val="Hyperlink"/>
@@ -2699,7 +2699,7 @@
             <w:noProof/>
             <w:webHidden/>
           </w:rPr>
-          <w:instrText xml:space="preserve"> PAGEREF _Toc240640207 \h </w:instrText>
+          <w:instrText xml:space="preserve"> PAGEREF _Toc240642085 \h </w:instrText>
         </w:r>
         <w:r>
           <w:rPr>
@@ -2719,7 +2719,7 @@
             <w:noProof/>
             <w:webHidden/>
           </w:rPr>
-          <w:t>30</w:t>
+          <w:t>31</w:t>
         </w:r>
         <w:r>
           <w:rPr>
@@ -2747,7 +2747,7 @@
           <w14:ligatures w14:val="standardContextual"/>
         </w:rPr>
       </w:pPr>
-      <w:hyperlink w:anchor="_Toc240640208" w:history="1">
+      <w:hyperlink w:anchor="_Toc240642086" w:history="1">
         <w:r>
           <w:rPr>
             <w:rStyle w:val="Hyperlink"/>
@@ -2775,7 +2775,7 @@
             <w:noProof/>
             <w:webHidden/>
           </w:rPr>
-          <w:instrText xml:space="preserve"> PAGEREF _Toc240640208 \h </w:instrText>
+          <w:instrText xml:space="preserve"> PAGEREF _Toc240642086 \h </w:instrText>
         </w:r>
         <w:r>
           <w:rPr>
@@ -2795,7 +2795,7 @@
             <w:noProof/>
             <w:webHidden/>
           </w:rPr>
-          <w:t>31</w:t>
+          <w:t>32</w:t>
         </w:r>
         <w:r>
           <w:rPr>
@@ -2823,7 +2823,7 @@
           <w14:ligatures w14:val="standardContextual"/>
         </w:rPr>
       </w:pPr>
-      <w:hyperlink w:anchor="_Toc240640209" w:history="1">
+      <w:hyperlink w:anchor="_Toc240642087" w:history="1">
         <w:r>
           <w:rPr>
             <w:rStyle w:val="Hyperlink"/>
@@ -2851,7 +2851,7 @@
             <w:noProof/>
             <w:webHidden/>
           </w:rPr>
-          <w:instrText xml:space="preserve"> PAGEREF _Toc240640209 \h </w:instrText>
+          <w:instrText xml:space="preserve"> PAGEREF _Toc240642087 \h </w:instrText>
         </w:r>
         <w:r>
           <w:rPr>
@@ -2871,7 +2871,7 @@
             <w:noProof/>
             <w:webHidden/>
           </w:rPr>
-          <w:t>32</w:t>
+          <w:t>33</w:t>
         </w:r>
         <w:r>
           <w:rPr>
@@ -2897,7 +2897,7 @@
         <w:pStyle w:val="Heading1"/>
         <w:spacing w:before="80" w:after="120"/>
       </w:pPr>
-      <w:bookmarkStart w:id="0" w:name="_Toc240640173"/>
+      <w:bookmarkStart w:id="0" w:name="_Toc240642051"/>
       <w:r>
         <w:rPr>
           <w:rFonts w:ascii="Segoe UI Semibold" w:hAnsi="Segoe UI Semibold"/>
@@ -2963,7 +2963,7 @@
           <w:noProof/>
         </w:rPr>
         <w:drawing>
-          <wp:inline distT="0" distB="0" distL="0" distR="0" wp14:anchorId="22378471" wp14:editId="46E0BA44">
+          <wp:inline distT="0" distB="0" distL="0" distR="0" wp14:anchorId="35682FC3" wp14:editId="78FD0A41">
             <wp:extent cx="5903999" cy="3749039"/>
             <wp:effectExtent l="0" t="0" r="0" b="0"/>
             <wp:docPr id="1" name="Picture 1"/>
@@ -3138,7 +3138,7 @@
         <w:pStyle w:val="Heading2"/>
         <w:spacing w:before="240" w:after="120"/>
       </w:pPr>
-      <w:bookmarkStart w:id="1" w:name="_Toc240640174"/>
+      <w:bookmarkStart w:id="1" w:name="_Toc240642052"/>
       <w:r>
         <w:rPr>
           <w:rFonts w:ascii="Segoe UI Semibold" w:hAnsi="Segoe UI Semibold"/>
@@ -3210,26 +3210,39 @@
                 <w:sz w:val="20"/>
               </w:rPr>
               <w:lastRenderedPageBreak/>
-              <w:t>The email-link button is not a way in by itself.</w:t>
+              <w:t>Signing in is not the same as being let in.</w:t>
             </w:r>
             <w:r>
               <w:rPr>
                 <w:sz w:val="20"/>
               </w:rPr>
-              <w:t xml:space="preserve"> It will send a link to any address typed into it, and the link will sign you in — but signing in proves only that you can receive email at that address. Until somebody at HQ has given it a role you will see </w:t>
+              <w:t xml:space="preserve"> Anybody can type any address into the email-link box, and the link really will arrive and really will sign them in. That sounds alarming and is not: all it checks is that they can open that inbox. What decides whether somebody sees the app is the </w:t>
             </w:r>
             <w:r>
               <w:rPr>
                 <w:b/>
                 <w:sz w:val="20"/>
               </w:rPr>
+              <w:t>role</w:t>
+            </w:r>
+            <w:r>
+              <w:rPr>
+                <w:sz w:val="20"/>
+              </w:rPr>
+              <w:t xml:space="preserve"> HQ has put against their address. Without one they get </w:t>
+            </w:r>
+            <w:r>
+              <w:rPr>
+                <w:b/>
+                <w:sz w:val="20"/>
+              </w:rPr>
               <w:t>“This account has no role yet”</w:t>
             </w:r>
             <w:r>
               <w:rPr>
                 <w:sz w:val="20"/>
               </w:rPr>
-              <w:t xml:space="preserve"> and nothing else. That includes guests: the role is given, not taken.</w:t>
+              <w:t xml:space="preserve"> and a sign-out button — no claims, no directory, nothing at all. Guests are no exception: nobody becomes a guest by signing in, somebody makes them one.</w:t>
             </w:r>
           </w:p>
         </w:tc>
@@ -3245,7 +3258,7 @@
         <w:pStyle w:val="Heading2"/>
         <w:spacing w:before="240" w:after="120"/>
       </w:pPr>
-      <w:bookmarkStart w:id="2" w:name="_Toc240640175"/>
+      <w:bookmarkStart w:id="2" w:name="_Toc240642053"/>
       <w:r>
         <w:rPr>
           <w:rFonts w:ascii="Segoe UI Semibold" w:hAnsi="Segoe UI Semibold"/>
@@ -3284,7 +3297,7 @@
           <w:noProof/>
         </w:rPr>
         <w:drawing>
-          <wp:inline distT="0" distB="0" distL="0" distR="0" wp14:anchorId="3656AD07" wp14:editId="3638B5B8">
+          <wp:inline distT="0" distB="0" distL="0" distR="0" wp14:anchorId="1E7F4538" wp14:editId="138F3483">
             <wp:extent cx="5903999" cy="2710920"/>
             <wp:effectExtent l="0" t="0" r="0" b="0"/>
             <wp:docPr id="2" name="Picture 2"/>
@@ -3536,6 +3549,7 @@
     </w:p>
     <w:p>
       <w:r>
+        <w:lastRenderedPageBreak/>
         <w:br w:type="page"/>
       </w:r>
     </w:p>
@@ -3544,7 +3558,7 @@
         <w:pStyle w:val="Heading1"/>
         <w:spacing w:before="80" w:after="120"/>
       </w:pPr>
-      <w:bookmarkStart w:id="3" w:name="_Toc240640176"/>
+      <w:bookmarkStart w:id="3" w:name="_Toc240642054"/>
       <w:r>
         <w:rPr>
           <w:rFonts w:ascii="Segoe UI Semibold" w:hAnsi="Segoe UI Semibold"/>
@@ -3999,7 +4013,7 @@
         <w:pStyle w:val="Heading2"/>
         <w:spacing w:before="240" w:after="120"/>
       </w:pPr>
-      <w:bookmarkStart w:id="4" w:name="_Toc240640177"/>
+      <w:bookmarkStart w:id="4" w:name="_Toc240642055"/>
       <w:r>
         <w:rPr>
           <w:rFonts w:ascii="Segoe UI Semibold" w:hAnsi="Segoe UI Semibold"/>
@@ -4061,7 +4075,7 @@
           <w:noProof/>
         </w:rPr>
         <w:drawing>
-          <wp:inline distT="0" distB="0" distL="0" distR="0" wp14:anchorId="38A014F5" wp14:editId="7050CEEC">
+          <wp:inline distT="0" distB="0" distL="0" distR="0" wp14:anchorId="77DE3DC8" wp14:editId="23F52AB4">
             <wp:extent cx="5903999" cy="3783479"/>
             <wp:effectExtent l="0" t="0" r="0" b="0"/>
             <wp:docPr id="3" name="Picture 3"/>
@@ -4373,7 +4387,7 @@
         <w:pStyle w:val="Heading1"/>
         <w:spacing w:before="80" w:after="120"/>
       </w:pPr>
-      <w:bookmarkStart w:id="5" w:name="_Toc240640178"/>
+      <w:bookmarkStart w:id="5" w:name="_Toc240642056"/>
       <w:r>
         <w:rPr>
           <w:rFonts w:ascii="Segoe UI Semibold" w:hAnsi="Segoe UI Semibold"/>
@@ -4530,7 +4544,7 @@
         <w:pStyle w:val="Heading2"/>
         <w:spacing w:before="240" w:after="120"/>
       </w:pPr>
-      <w:bookmarkStart w:id="6" w:name="_Toc240640179"/>
+      <w:bookmarkStart w:id="6" w:name="_Toc240642057"/>
       <w:r>
         <w:rPr>
           <w:rFonts w:ascii="Segoe UI Semibold" w:hAnsi="Segoe UI Semibold"/>
@@ -4838,7 +4852,7 @@
         <w:pStyle w:val="Heading1"/>
         <w:spacing w:before="80" w:after="120"/>
       </w:pPr>
-      <w:bookmarkStart w:id="7" w:name="_Toc240640180"/>
+      <w:bookmarkStart w:id="7" w:name="_Toc240642058"/>
       <w:r>
         <w:rPr>
           <w:rFonts w:ascii="Segoe UI Semibold" w:hAnsi="Segoe UI Semibold"/>
@@ -4897,7 +4911,7 @@
         <w:pStyle w:val="Heading2"/>
         <w:spacing w:before="240" w:after="120"/>
       </w:pPr>
-      <w:bookmarkStart w:id="8" w:name="_Toc240640181"/>
+      <w:bookmarkStart w:id="8" w:name="_Toc240642059"/>
       <w:r>
         <w:rPr>
           <w:rFonts w:ascii="Segoe UI Semibold" w:hAnsi="Segoe UI Semibold"/>
@@ -5026,7 +5040,7 @@
         <w:pStyle w:val="Heading2"/>
         <w:spacing w:before="240" w:after="120"/>
       </w:pPr>
-      <w:bookmarkStart w:id="9" w:name="_Toc240640182"/>
+      <w:bookmarkStart w:id="9" w:name="_Toc240642060"/>
       <w:r>
         <w:rPr>
           <w:rFonts w:ascii="Segoe UI Semibold" w:hAnsi="Segoe UI Semibold"/>
@@ -5138,7 +5152,7 @@
         <w:pStyle w:val="Heading1"/>
         <w:spacing w:before="80" w:after="120"/>
       </w:pPr>
-      <w:bookmarkStart w:id="10" w:name="_Toc240640183"/>
+      <w:bookmarkStart w:id="10" w:name="_Toc240642061"/>
       <w:r>
         <w:rPr>
           <w:rFonts w:ascii="Segoe UI Semibold" w:hAnsi="Segoe UI Semibold"/>
@@ -5167,7 +5181,7 @@
         <w:pStyle w:val="Heading2"/>
         <w:spacing w:before="240" w:after="120"/>
       </w:pPr>
-      <w:bookmarkStart w:id="11" w:name="_Toc240640184"/>
+      <w:bookmarkStart w:id="11" w:name="_Toc240642062"/>
       <w:r>
         <w:rPr>
           <w:rFonts w:ascii="Segoe UI Semibold" w:hAnsi="Segoe UI Semibold"/>
@@ -5276,7 +5290,7 @@
         <w:pStyle w:val="Heading2"/>
         <w:spacing w:before="240" w:after="120"/>
       </w:pPr>
-      <w:bookmarkStart w:id="12" w:name="_Toc240640185"/>
+      <w:bookmarkStart w:id="12" w:name="_Toc240642063"/>
       <w:r>
         <w:rPr>
           <w:rFonts w:ascii="Segoe UI Semibold" w:hAnsi="Segoe UI Semibold"/>
@@ -5348,7 +5362,7 @@
         <w:pStyle w:val="Heading2"/>
         <w:spacing w:before="240" w:after="120"/>
       </w:pPr>
-      <w:bookmarkStart w:id="13" w:name="_Toc240640186"/>
+      <w:bookmarkStart w:id="13" w:name="_Toc240642064"/>
       <w:r>
         <w:rPr>
           <w:rFonts w:ascii="Segoe UI Semibold" w:hAnsi="Segoe UI Semibold"/>
@@ -5599,7 +5613,7 @@
         <w:pStyle w:val="Heading1"/>
         <w:spacing w:before="80" w:after="120"/>
       </w:pPr>
-      <w:bookmarkStart w:id="14" w:name="_Toc240640187"/>
+      <w:bookmarkStart w:id="14" w:name="_Toc240642065"/>
       <w:r>
         <w:rPr>
           <w:rFonts w:ascii="Segoe UI Semibold" w:hAnsi="Segoe UI Semibold"/>
@@ -5713,7 +5727,7 @@
         <w:pStyle w:val="Heading2"/>
         <w:spacing w:before="240" w:after="120"/>
       </w:pPr>
-      <w:bookmarkStart w:id="15" w:name="_Toc240640188"/>
+      <w:bookmarkStart w:id="15" w:name="_Toc240642066"/>
       <w:r>
         <w:rPr>
           <w:rFonts w:ascii="Segoe UI Semibold" w:hAnsi="Segoe UI Semibold"/>
@@ -5742,7 +5756,7 @@
           <w:noProof/>
         </w:rPr>
         <w:drawing>
-          <wp:inline distT="0" distB="0" distL="0" distR="0" wp14:anchorId="671F1E5B" wp14:editId="2FDC752E">
+          <wp:inline distT="0" distB="0" distL="0" distR="0" wp14:anchorId="0F73F769" wp14:editId="6EE73D93">
             <wp:extent cx="5903999" cy="3237359"/>
             <wp:effectExtent l="0" t="0" r="0" b="0"/>
             <wp:docPr id="4" name="Picture 4"/>
@@ -6030,7 +6044,7 @@
         <w:pStyle w:val="Heading2"/>
         <w:spacing w:before="240" w:after="120"/>
       </w:pPr>
-      <w:bookmarkStart w:id="16" w:name="_Toc240640189"/>
+      <w:bookmarkStart w:id="16" w:name="_Toc240642067"/>
       <w:r>
         <w:rPr>
           <w:rFonts w:ascii="Segoe UI Semibold" w:hAnsi="Segoe UI Semibold"/>
@@ -6060,7 +6074,7 @@
         </w:rPr>
         <w:lastRenderedPageBreak/>
         <w:drawing>
-          <wp:inline distT="0" distB="0" distL="0" distR="0" wp14:anchorId="378843AC" wp14:editId="0198EEC9">
+          <wp:inline distT="0" distB="0" distL="0" distR="0" wp14:anchorId="383226B7" wp14:editId="77040D20">
             <wp:extent cx="2700000" cy="4849615"/>
             <wp:effectExtent l="0" t="0" r="0" b="0"/>
             <wp:docPr id="5" name="Picture 5"/>
@@ -6380,7 +6394,7 @@
         <w:pStyle w:val="Heading1"/>
         <w:spacing w:before="80" w:after="120"/>
       </w:pPr>
-      <w:bookmarkStart w:id="17" w:name="_Toc240640190"/>
+      <w:bookmarkStart w:id="17" w:name="_Toc240642068"/>
       <w:r>
         <w:rPr>
           <w:rFonts w:ascii="Segoe UI Semibold" w:hAnsi="Segoe UI Semibold"/>
@@ -6603,7 +6617,7 @@
         <w:pStyle w:val="Heading2"/>
         <w:spacing w:before="240" w:after="120"/>
       </w:pPr>
-      <w:bookmarkStart w:id="18" w:name="_Toc240640191"/>
+      <w:bookmarkStart w:id="18" w:name="_Toc240642069"/>
       <w:r>
         <w:rPr>
           <w:rFonts w:ascii="Segoe UI Semibold" w:hAnsi="Segoe UI Semibold"/>
@@ -6802,7 +6816,7 @@
         <w:pStyle w:val="Heading2"/>
         <w:spacing w:before="240" w:after="120"/>
       </w:pPr>
-      <w:bookmarkStart w:id="19" w:name="_Toc240640192"/>
+      <w:bookmarkStart w:id="19" w:name="_Toc240642070"/>
       <w:r>
         <w:rPr>
           <w:rFonts w:ascii="Segoe UI Semibold" w:hAnsi="Segoe UI Semibold"/>
@@ -6875,7 +6889,7 @@
         <w:pStyle w:val="Heading2"/>
         <w:spacing w:before="240" w:after="120"/>
       </w:pPr>
-      <w:bookmarkStart w:id="20" w:name="_Toc240640193"/>
+      <w:bookmarkStart w:id="20" w:name="_Toc240642071"/>
       <w:r>
         <w:rPr>
           <w:rFonts w:ascii="Segoe UI Semibold" w:hAnsi="Segoe UI Semibold"/>
@@ -7105,7 +7119,7 @@
         <w:pStyle w:val="Heading1"/>
         <w:spacing w:before="80" w:after="120"/>
       </w:pPr>
-      <w:bookmarkStart w:id="21" w:name="_Toc240640194"/>
+      <w:bookmarkStart w:id="21" w:name="_Toc240642072"/>
       <w:r>
         <w:rPr>
           <w:rFonts w:ascii="Segoe UI Semibold" w:hAnsi="Segoe UI Semibold"/>
@@ -7350,7 +7364,7 @@
         <w:pStyle w:val="Heading1"/>
         <w:spacing w:before="80" w:after="120"/>
       </w:pPr>
-      <w:bookmarkStart w:id="22" w:name="_Toc240640195"/>
+      <w:bookmarkStart w:id="22" w:name="_Toc240642073"/>
       <w:r>
         <w:rPr>
           <w:rFonts w:ascii="Segoe UI Semibold" w:hAnsi="Segoe UI Semibold"/>
@@ -7571,7 +7585,7 @@
         <w:pStyle w:val="Heading1"/>
         <w:spacing w:before="80" w:after="120"/>
       </w:pPr>
-      <w:bookmarkStart w:id="23" w:name="_Toc240640196"/>
+      <w:bookmarkStart w:id="23" w:name="_Toc240642074"/>
       <w:r>
         <w:rPr>
           <w:rFonts w:ascii="Segoe UI Semibold" w:hAnsi="Segoe UI Semibold"/>
@@ -7892,7 +7906,7 @@
         <w:pStyle w:val="Heading1"/>
         <w:spacing w:before="80" w:after="120"/>
       </w:pPr>
-      <w:bookmarkStart w:id="24" w:name="_Toc240640197"/>
+      <w:bookmarkStart w:id="24" w:name="_Toc240642075"/>
       <w:r>
         <w:rPr>
           <w:rFonts w:ascii="Segoe UI Semibold" w:hAnsi="Segoe UI Semibold"/>
@@ -8476,7 +8490,7 @@
         <w:pStyle w:val="Heading2"/>
         <w:spacing w:before="240" w:after="120"/>
       </w:pPr>
-      <w:bookmarkStart w:id="25" w:name="_Toc240640198"/>
+      <w:bookmarkStart w:id="25" w:name="_Toc240642076"/>
       <w:r>
         <w:rPr>
           <w:rFonts w:ascii="Segoe UI Semibold" w:hAnsi="Segoe UI Semibold"/>
@@ -8666,7 +8680,7 @@
         <w:pStyle w:val="Heading1"/>
         <w:spacing w:before="80" w:after="120"/>
       </w:pPr>
-      <w:bookmarkStart w:id="26" w:name="_Toc240640199"/>
+      <w:bookmarkStart w:id="26" w:name="_Toc240642077"/>
       <w:r>
         <w:rPr>
           <w:rFonts w:ascii="Segoe UI Semibold" w:hAnsi="Segoe UI Semibold"/>
@@ -8715,7 +8729,7 @@
           <w:noProof/>
         </w:rPr>
         <w:drawing>
-          <wp:inline distT="0" distB="0" distL="0" distR="0" wp14:anchorId="630D4B91" wp14:editId="1018DC83">
+          <wp:inline distT="0" distB="0" distL="0" distR="0" wp14:anchorId="71786BE0" wp14:editId="33CF55E7">
             <wp:extent cx="5903999" cy="4560839"/>
             <wp:effectExtent l="0" t="0" r="0" b="0"/>
             <wp:docPr id="6" name="Picture 6"/>
@@ -9763,7 +9777,7 @@
         <w:pStyle w:val="Heading2"/>
         <w:spacing w:before="240" w:after="120"/>
       </w:pPr>
-      <w:bookmarkStart w:id="27" w:name="_Toc240640200"/>
+      <w:bookmarkStart w:id="27" w:name="_Toc240642078"/>
       <w:r>
         <w:rPr>
           <w:rFonts w:ascii="Segoe UI Semibold" w:hAnsi="Segoe UI Semibold"/>
@@ -9784,7 +9798,7 @@
           <w:noProof/>
         </w:rPr>
         <w:drawing>
-          <wp:inline distT="0" distB="0" distL="0" distR="0" wp14:anchorId="24D03C92" wp14:editId="63B0829B">
+          <wp:inline distT="0" distB="0" distL="0" distR="0" wp14:anchorId="341F5D8E" wp14:editId="3254D3DF">
             <wp:extent cx="5903999" cy="4826519"/>
             <wp:effectExtent l="0" t="0" r="0" b="0"/>
             <wp:docPr id="7" name="Picture 7"/>
@@ -10050,7 +10064,7 @@
         <w:pStyle w:val="Heading1"/>
         <w:spacing w:before="80" w:after="120"/>
       </w:pPr>
-      <w:bookmarkStart w:id="28" w:name="_Toc240640201"/>
+      <w:bookmarkStart w:id="28" w:name="_Toc240642079"/>
       <w:r>
         <w:rPr>
           <w:rFonts w:ascii="Segoe UI Semibold" w:hAnsi="Segoe UI Semibold"/>
@@ -10643,7 +10657,7 @@
           <w:noProof/>
         </w:rPr>
         <w:drawing>
-          <wp:inline distT="0" distB="0" distL="0" distR="0" wp14:anchorId="058F5EC9" wp14:editId="6833FCC4">
+          <wp:inline distT="0" distB="0" distL="0" distR="0" wp14:anchorId="7B50F031" wp14:editId="6B1B945D">
             <wp:extent cx="5903999" cy="3193079"/>
             <wp:effectExtent l="0" t="0" r="0" b="0"/>
             <wp:docPr id="8" name="Picture 8"/>
@@ -10795,7 +10809,7 @@
         <w:pStyle w:val="Heading2"/>
         <w:spacing w:before="240" w:after="120"/>
       </w:pPr>
-      <w:bookmarkStart w:id="29" w:name="_Toc240640202"/>
+      <w:bookmarkStart w:id="29" w:name="_Toc240642080"/>
       <w:r>
         <w:rPr>
           <w:rFonts w:ascii="Segoe UI Semibold" w:hAnsi="Segoe UI Semibold"/>
@@ -10817,7 +10831,7 @@
           <w:noProof/>
         </w:rPr>
         <w:drawing>
-          <wp:inline distT="0" distB="0" distL="0" distR="0" wp14:anchorId="2D74CA70" wp14:editId="7486FF5B">
+          <wp:inline distT="0" distB="0" distL="0" distR="0" wp14:anchorId="1C17AAB3" wp14:editId="52FC52B1">
             <wp:extent cx="5903999" cy="3306239"/>
             <wp:effectExtent l="0" t="0" r="0" b="0"/>
             <wp:docPr id="9" name="Picture 9"/>
@@ -11061,7 +11075,7 @@
         <w:pStyle w:val="Heading1"/>
         <w:spacing w:before="80" w:after="120"/>
       </w:pPr>
-      <w:bookmarkStart w:id="30" w:name="_Toc240640203"/>
+      <w:bookmarkStart w:id="30" w:name="_Toc240642081"/>
       <w:r>
         <w:rPr>
           <w:rFonts w:ascii="Segoe UI Semibold" w:hAnsi="Segoe UI Semibold"/>
@@ -11105,7 +11119,7 @@
         <w:pStyle w:val="Heading2"/>
         <w:spacing w:before="240" w:after="120"/>
       </w:pPr>
-      <w:bookmarkStart w:id="31" w:name="_Toc240640204"/>
+      <w:bookmarkStart w:id="31" w:name="_Toc240642082"/>
       <w:r>
         <w:rPr>
           <w:rFonts w:ascii="Segoe UI Semibold" w:hAnsi="Segoe UI Semibold"/>
@@ -11393,7 +11407,7 @@
         <w:pStyle w:val="Heading2"/>
         <w:spacing w:before="240" w:after="120"/>
       </w:pPr>
-      <w:bookmarkStart w:id="32" w:name="_Toc240640205"/>
+      <w:bookmarkStart w:id="32" w:name="_Toc240642083"/>
       <w:r>
         <w:rPr>
           <w:rFonts w:ascii="Segoe UI Semibold" w:hAnsi="Segoe UI Semibold"/>
@@ -11534,7 +11548,7 @@
         <w:pStyle w:val="Heading2"/>
         <w:spacing w:before="240" w:after="120"/>
       </w:pPr>
-      <w:bookmarkStart w:id="33" w:name="_Toc240640206"/>
+      <w:bookmarkStart w:id="33" w:name="_Toc240642084"/>
       <w:r>
         <w:rPr>
           <w:rFonts w:ascii="Segoe UI Semibold" w:hAnsi="Segoe UI Semibold"/>
@@ -11634,7 +11648,7 @@
         <w:pStyle w:val="Heading2"/>
         <w:spacing w:before="240" w:after="120"/>
       </w:pPr>
-      <w:bookmarkStart w:id="34" w:name="_Toc240640207"/>
+      <w:bookmarkStart w:id="34" w:name="_Toc240642085"/>
       <w:r>
         <w:rPr>
           <w:rFonts w:ascii="Segoe UI Semibold" w:hAnsi="Segoe UI Semibold"/>
@@ -11791,7 +11805,7 @@
         <w:pStyle w:val="Heading1"/>
         <w:spacing w:before="80" w:after="120"/>
       </w:pPr>
-      <w:bookmarkStart w:id="35" w:name="_Toc240640208"/>
+      <w:bookmarkStart w:id="35" w:name="_Toc240642086"/>
       <w:r>
         <w:rPr>
           <w:rFonts w:ascii="Segoe UI Semibold" w:hAnsi="Segoe UI Semibold"/>
@@ -13208,7 +13222,7 @@
         <w:pStyle w:val="Heading1"/>
         <w:spacing w:before="80" w:after="120"/>
       </w:pPr>
-      <w:bookmarkStart w:id="36" w:name="_Toc240640209"/>
+      <w:bookmarkStart w:id="36" w:name="_Toc240642087"/>
       <w:r>
         <w:rPr>
           <w:rFonts w:ascii="Segoe UI Semibold" w:hAnsi="Segoe UI Semibold"/>
@@ -14183,31 +14197,31 @@
       </w:rPr>
     </w:lvl>
   </w:abstractNum>
-  <w:num w:numId="1" w16cid:durableId="1164122217">
+  <w:num w:numId="1" w16cid:durableId="1012995914">
     <w:abstractNumId w:val="8"/>
   </w:num>
-  <w:num w:numId="2" w16cid:durableId="1378044676">
+  <w:num w:numId="2" w16cid:durableId="38097331">
     <w:abstractNumId w:val="6"/>
   </w:num>
-  <w:num w:numId="3" w16cid:durableId="94447033">
+  <w:num w:numId="3" w16cid:durableId="428964141">
     <w:abstractNumId w:val="5"/>
   </w:num>
-  <w:num w:numId="4" w16cid:durableId="383994515">
+  <w:num w:numId="4" w16cid:durableId="16471904">
     <w:abstractNumId w:val="4"/>
   </w:num>
-  <w:num w:numId="5" w16cid:durableId="2061703536">
+  <w:num w:numId="5" w16cid:durableId="1649019375">
     <w:abstractNumId w:val="7"/>
   </w:num>
-  <w:num w:numId="6" w16cid:durableId="1347093631">
+  <w:num w:numId="6" w16cid:durableId="1090085681">
     <w:abstractNumId w:val="3"/>
   </w:num>
-  <w:num w:numId="7" w16cid:durableId="482166393">
+  <w:num w:numId="7" w16cid:durableId="1817867421">
     <w:abstractNumId w:val="2"/>
   </w:num>
-  <w:num w:numId="8" w16cid:durableId="686953340">
+  <w:num w:numId="8" w16cid:durableId="1949894384">
     <w:abstractNumId w:val="1"/>
   </w:num>
-  <w:num w:numId="9" w16cid:durableId="2107996901">
+  <w:num w:numId="9" w16cid:durableId="663165867">
     <w:abstractNumId w:val="0"/>
   </w:num>
 </w:numbering>
@@ -25605,7 +25619,7 @@
     <w:autoRedefine/>
     <w:uiPriority w:val="39"/>
     <w:unhideWhenUsed/>
-    <w:rsid w:val="00B12834"/>
+    <w:rsid w:val="003A766A"/>
     <w:pPr>
       <w:spacing w:after="100"/>
     </w:pPr>
@@ -25617,7 +25631,7 @@
     <w:autoRedefine/>
     <w:uiPriority w:val="39"/>
     <w:unhideWhenUsed/>
-    <w:rsid w:val="00B12834"/>
+    <w:rsid w:val="003A766A"/>
     <w:pPr>
       <w:spacing w:after="100"/>
       <w:ind w:left="210"/>
@@ -25628,7 +25642,7 @@
     <w:basedOn w:val="DefaultParagraphFont"/>
     <w:uiPriority w:val="99"/>
     <w:unhideWhenUsed/>
-    <w:rsid w:val="00B12834"/>
+    <w:rsid w:val="003A766A"/>
     <w:rPr>
       <w:color w:val="0000FF" w:themeColor="hyperlink"/>
       <w:u w:val="single"/>

</xml_diff>

<commit_message>
docs(budget): say what the four budget answers mean
The guides and the handbook still described the budget as a line that can
be breached, and told people that spending outside one "will show as
Unbudgeted" — a label that no longer exists and, worse, an idea the EXCO
does not hold. They approve a ministry's allocation and describe in
general terms what it is for; they do not approve each project.

So the chip now has four answers and only one is a problem, and the text
says which. A finished line means the spending comes out of the rest of
the allocation. A project nobody listed is still covered by it. Reaching
the allocation itself is the one thing to stop and ask about.

Also documents verify-budget.sql in scripts/README.md, and regenerates the
ten role guides and the handbook from the corrected source.

Co-Authored-By: Claude Opus 5 <noreply@anthropic.com>
</commit_message>
<xml_diff>
--- a/docs/LCM Finance Handbook.docx
+++ b/docs/LCM Finance Handbook.docx
@@ -2605,7 +2605,7 @@
           <w:i w:val="0"/>
           <w:sz w:val="21"/>
         </w:rPr>
-        <w:t xml:space="preserve"> You are not checking the arithmetic — Finance has done that — and you are not deciding whether the church can afford it, which is the Treasurer’s. The card shows what the payment does to your ministry’s budget before you decide, including when it is </w:t>
+        <w:t xml:space="preserve"> You are not checking the arithmetic — Finance has done that — and you are not deciding whether the church can afford it, which is the Treasurer’s. The card shows what the payment does to your ministry’s budget before you decide. Most of what it can say is ordinary: the line may be finished, in which case the spending comes out of the rest of your allocation, and the project may not be one of those listed in January, which the EXCO’s allocation still covers. Only </w:t>
       </w:r>
       <w:r>
         <w:rPr>
@@ -2613,15 +2613,15 @@
           <w:i/>
           <w:sz w:val="21"/>
         </w:rPr>
-        <w:t>Unbudgeted</w:t>
-      </w:r>
-      <w:r>
-        <w:rPr>
-          <w:b w:val="0"/>
-          <w:i w:val="0"/>
-          <w:sz w:val="21"/>
-        </w:rPr>
-        <w:t>, which is worth a pause rather than a refusal.</w:t>
+        <w:t>Over the allocation</w:t>
+      </w:r>
+      <w:r>
+        <w:rPr>
+          <w:b w:val="0"/>
+          <w:i w:val="0"/>
+          <w:sz w:val="21"/>
+        </w:rPr>
+        <w:t xml:space="preserve"> means the ministry has reached the figure the EXCO voted, and that is worth a pause rather than a refusal.</w:t>
       </w:r>
     </w:p>
     <w:tbl>
@@ -6001,7 +6001,7 @@
           <w:i w:val="0"/>
           <w:sz w:val="21"/>
         </w:rPr>
-        <w:t xml:space="preserve">Each card carries a chip saying how the payment sits against its budget — </w:t>
+        <w:t xml:space="preserve">Each card carries a chip saying how the payment sits against its budget. Four things it can say, and only one of them is a problem: </w:t>
       </w:r>
       <w:r>
         <w:rPr>
@@ -6025,15 +6025,15 @@
           <w:i/>
           <w:sz w:val="21"/>
         </w:rPr>
-        <w:t>Over budget</w:t>
-      </w:r>
-      <w:r>
-        <w:rPr>
-          <w:b w:val="0"/>
-          <w:i w:val="0"/>
-          <w:sz w:val="21"/>
-        </w:rPr>
-        <w:t xml:space="preserve"> by how much, or </w:t>
+        <w:t>Drawn from the ministry</w:t>
+      </w:r>
+      <w:r>
+        <w:rPr>
+          <w:b w:val="0"/>
+          <w:i w:val="0"/>
+          <w:sz w:val="21"/>
+        </w:rPr>
+        <w:t xml:space="preserve"> when that project’s line is finished and the rest of the ministry’s allocation covers it, </w:t>
       </w:r>
       <w:r>
         <w:rPr>
@@ -6041,15 +6041,31 @@
           <w:i/>
           <w:sz w:val="21"/>
         </w:rPr>
-        <w:t>Unbudgeted</w:t>
-      </w:r>
-      <w:r>
-        <w:rPr>
-          <w:b w:val="0"/>
-          <w:i w:val="0"/>
-          <w:sz w:val="21"/>
-        </w:rPr>
-        <w:t xml:space="preserve">. </w:t>
+        <w:t>Not in the outline</w:t>
+      </w:r>
+      <w:r>
+        <w:rPr>
+          <w:b w:val="0"/>
+          <w:i w:val="0"/>
+          <w:sz w:val="21"/>
+        </w:rPr>
+        <w:t xml:space="preserve"> when the project was never listed, and </w:t>
+      </w:r>
+      <w:r>
+        <w:rPr>
+          <w:b w:val="0"/>
+          <w:i/>
+          <w:sz w:val="21"/>
+        </w:rPr>
+        <w:t>Over the allocation</w:t>
+      </w:r>
+      <w:r>
+        <w:rPr>
+          <w:b w:val="0"/>
+          <w:i w:val="0"/>
+          <w:sz w:val="21"/>
+        </w:rPr>
+        <w:t xml:space="preserve"> by how much — which means the ministry has reached the figure the EXCO voted. </w:t>
       </w:r>
       <w:r>
         <w:rPr>
@@ -6065,7 +6081,20 @@
           <w:i w:val="0"/>
           <w:sz w:val="21"/>
         </w:rPr>
-        <w:t>, naming the exact line in that ministry’s budget and showing what was approved, what has been spent, what is committed but not yet paid, and what would remain if you sign. The ministry’s overall position is underneath it.</w:t>
+        <w:t>, naming the exact line in that ministry’s budget and showing what was approved, what has been spent, what is committed but not yet paid, and what would remain if you sign. The ministry’s overall position is underneath it, against the allocation the EXCO approved.</w:t>
+      </w:r>
+    </w:p>
+    <w:p>
+      <w:pPr>
+        <w:spacing w:after="120" w:line="283" w:lineRule="auto"/>
+      </w:pPr>
+      <w:r>
+        <w:rPr>
+          <w:b w:val="0"/>
+          <w:i w:val="0"/>
+          <w:sz w:val="21"/>
+        </w:rPr>
+        <w:t>The EXCO votes each ministry an allocation and agrees in general terms what it is for; it does not approve the individual projects. So a ministry’s lines are an outline, they may add up to less than the allocation, and the remainder stays available for what was too early to plan. Raising the allocation itself takes an EXCO resolution.</w:t>
       </w:r>
     </w:p>
     <w:p>

</xml_diff>